<commit_message>
Tested whole application and eliminated useless tests
</commit_message>
<xml_diff>
--- a/shared documentation/API_CONTRACTS.docx
+++ b/shared documentation/API_CONTRACTS.docx
@@ -20,7 +20,7 @@
     </w:p>
     <w:p>
       <w:r>
-        <w:t>Aggiornato al 12/10/2026 (tolto il tipo ManagementRequest; idProperty fa parte di PageRequest, il corpo di ogni tabella; ogni tabella manda lo stesso corpo: idProperty, page, pageSize, search, filters, sortField, sortDirection; nuovo campo filters, array di { field, value }, [] se non ci sono filtri; warehouse/list non manda più datetimeFrom, datetimeTo e bookingDayType, che torneranno come filters; taxation/printer-list diventa POST con quel corpo e risponde con una pagina (total, rows) invece che con un array; nuova API database/existing-booking-list, la tabella della pagina Database; nuova API taxation/save-electronic-receipt-account, il bottone Salva del form Configurazione account; nuova API taxation/electronic-receipt-activation, il bottone Invia dei termini dello scontrino elettronico; nuova API taxation/add-printer, il bottone Salva del popup "Aggiungi nuova stampante"; in auth/signin e auth/refresh, user ha il nuovo campo isElectronicReceiptAccepted). Prima, il 09/10/2026 (nuova API taxation/download-guide-electronic-receipt, il bottone "Scarica la guida" scarica un file; nuove API taxation/set-is-active, interruttore di una stampante, e taxation/delete-printer, cestino di una stampante; Accept-Language può valere anche zh, cinese semplificato, e ar, arabo). Prima, il 08/10/2026 (Accept-Language può valere anche fr, es, de; nuove API taxation/printer-list e taxation/electronic-receipt per la pagina Fiscalizzazione). Prima, il 07/10/2026 (un id non valido non è mai un errore di campo in errors[]: idProperty dà 403 operation.not_allowed e un articolo inesistente 404 resource.not_found, due codici nuovi, e l'operazione è annullata; warehouse/add-warehouse-item e warehouse/edit-warehouse-item: il corpo è una riga di warehouse/list (WarehouseItem) con idProperty; nella modifica idArticle e totalQuantity sostituiscono idItem e articleQuantity, nell'aggiunta totalQuantity sostituisce articleQuantity; system/email-configuration non restituisce mai la password SMTP ma solo hasSmtpPassword, e in salvataggio e invio di prova smtpPassword null mantiene quella salvata). Prima, il 06/10/2026 (nuova API system/save-email-configuration per il bottone Salva, stesso corpo dell'invio di prova (EmailConfigurationRequest); nuova API system/send-test-email per il bottone Invia email test; nuova API GET system/email-configuration per la pagina Configurazione email; nuova API system/info-support con telefono, email e orari della pagina Assistenza e guide). Prima, il 05/10/2026 (nuova API system/contact-support per il form della pagina Assistenza e guide; nuova API warehouse/duplicate-warehouse-item, stessa forma dell'eliminazione, nomi delle copie scelti dal backend; nuova API warehouse/delete-warehouse-item, un solo id o più id insieme, tutto o niente; in warehouse/list i campi delle quantità finiscono con Quantity: totalQuantity, availableQuantity e thresholdQuantity, prima total, available e thresholdNumber; nuova API warehouse/edit-warehouse-item per il popup "Modifica articolo" e, in warehouse/list, nuovo campo isThresholdWarningActive; quantità sempre maggiore di 0; nuova API warehouse/add-warehouse-item per il bottone Aggiungi del popup "Aggiungi articolo"; nuova API warehouse/combobox-list per la tendina degli articoli; in warehouse/list availableQuantity e thresholdQuantity sempre presenti). Prima, il 01/10/2026 (errori: formato Problem Details con code, errori possibili per API e catalogo dei codici; header Accept-Language; formato dei valori in args). Oggi tutte le API sono simulate dai mock del frontend (services/mocks).</w:t>
+        <w:t>Aggiornato al 12/10/2026 (taxation/save-electronic-receipt-account: pin e password null mantengono quelli salvati, come smtpPassword; tolto il tipo ManagementRequest; idProperty fa parte di PageRequest, il corpo di ogni tabella; ogni tabella manda lo stesso corpo: idProperty, page, pageSize, search, filters, sortField, sortDirection; nuovo campo filters, array di { field, value }, [] se non ci sono filtri; warehouse/list non manda più datetimeFrom, datetimeTo e bookingDayType, che torneranno come filters; taxation/printer-list diventa POST con quel corpo e risponde con una pagina (total, rows) invece che con un array; nuova API database/existing-booking-list, la tabella della pagina Database; nuova API taxation/save-electronic-receipt-account, il bottone Salva del form Configurazione account; nuova API taxation/electronic-receipt-activation, il bottone Invia dei termini dello scontrino elettronico; nuova API taxation/add-printer, il bottone Salva del popup "Aggiungi nuova stampante"; in auth/signin e auth/refresh, user ha il nuovo campo isElectronicReceiptAccepted). Prima, il 09/10/2026 (nuova API taxation/download-guide-electronic-receipt, il bottone "Scarica la guida" scarica un file; nuove API taxation/set-is-active, interruttore di una stampante, e taxation/delete-printer, cestino di una stampante; Accept-Language può valere anche zh, cinese semplificato, e ar, arabo). Prima, il 08/10/2026 (Accept-Language può valere anche fr, es, de; nuove API taxation/printer-list e taxation/electronic-receipt per la pagina Fiscalizzazione). Prima, il 07/10/2026 (un id non valido non è mai un errore di campo in errors[]: idProperty dà 403 operation.not_allowed e un articolo inesistente 404 resource.not_found, due codici nuovi, e l'operazione è annullata; warehouse/add-warehouse-item e warehouse/edit-warehouse-item: il corpo è una riga di warehouse/list (WarehouseItem) con idProperty; nella modifica idArticle e totalQuantity sostituiscono idItem e articleQuantity, nell'aggiunta totalQuantity sostituisce articleQuantity; system/email-configuration non restituisce mai la password SMTP ma solo hasSmtpPassword, e in salvataggio e invio di prova smtpPassword null mantiene quella salvata). Prima, il 06/10/2026 (nuova API system/save-email-configuration per il bottone Salva, stesso corpo dell'invio di prova (EmailConfigurationRequest); nuova API system/send-test-email per il bottone Invia email test; nuova API GET system/email-configuration per la pagina Configurazione email; nuova API system/info-support con telefono, email e orari della pagina Assistenza e guide). Prima, il 05/10/2026 (nuova API system/contact-support per il form della pagina Assistenza e guide; nuova API warehouse/duplicate-warehouse-item, stessa forma dell'eliminazione, nomi delle copie scelti dal backend; nuova API warehouse/delete-warehouse-item, un solo id o più id insieme, tutto o niente; in warehouse/list i campi delle quantità finiscono con Quantity: totalQuantity, availableQuantity e thresholdQuantity, prima total, available e thresholdNumber; nuova API warehouse/edit-warehouse-item per il popup "Modifica articolo" e, in warehouse/list, nuovo campo isThresholdWarningActive; quantità sempre maggiore di 0; nuova API warehouse/add-warehouse-item per il bottone Aggiungi del popup "Aggiungi articolo"; nuova API warehouse/combobox-list per la tendina degli articoli; in warehouse/list availableQuantity e thresholdQuantity sempre presenti). Prima, il 01/10/2026 (errori: formato Problem Details con code, errori possibili per API e catalogo dei codici; header Accept-Language; formato dei valori in args). Oggi tutte le API sono simulate dai mock del frontend (services/mocks).</w:t>
       </w:r>
     </w:p>
     <w:p>
@@ -32205,6 +32205,14 @@
         <w:pStyle w:val="ListBullet"/>
       </w:pPr>
       <w:r>
+        <w:t>Dopo un salvataggio riuscito PIN e password lasciano la pagina, come la password SMTP: i campi tornano vuoti, e un campo lasciato vuoto viaggia come null, che mantiene il valore salvato.</w:t>
+      </w:r>
+    </w:p>
+    <w:p>
+      <w:pPr>
+        <w:pStyle w:val="ListBullet"/>
+      </w:pPr>
+      <w:r>
         <w:t>Durante la chiamata il bottone mostra lo spinner e i campi sono bloccati. Se riesce compare in alto l'etichetta "Account configurato con successo"; se fallisce l'errore di un campo (errors[] con field uguale al nome nel corpo) va sotto quel campo, gli altri sopra Salva. Dopo un salvataggio riuscito i campi sono in sola lettura con il bottone Modifica, che oggi riapre tutti i campi tranne la password: la stessa API si richiama con tutti i campi, compresi quelli non cambiati.</w:t>
       </w:r>
     </w:p>
@@ -32935,7 +32943,7 @@
                 <w:b w:val="0"/>
                 <w:sz w:val="19"/>
               </w:rPr>
-              <w:t>PIN dell'account dello scontrino elettronico.</w:t>
+              <w:t>PIN dell'account dello scontrino elettronico, se l'utente ne ha scritto uno; null = il server mantiene quello già salvato. Il server non deve mai rimandarlo al browser.</w:t>
             </w:r>
           </w:p>
         </w:tc>
@@ -32995,7 +33003,7 @@
                 <w:b w:val="0"/>
                 <w:sz w:val="19"/>
               </w:rPr>
-              <w:t>Password dell'account dello scontrino elettronico. Il server non deve mai rimandarla al browser.</w:t>
+              <w:t>Password dell'account dello scontrino elettronico, se l'utente ne ha scritta una; null = il server mantiene quella già salvata. Il server non deve mai rimandarla al browser.</w:t>
             </w:r>
           </w:p>
         </w:tc>

</xml_diff>

<commit_message>
Advancement in development - Database page
</commit_message>
<xml_diff>
--- a/shared documentation/API_CONTRACTS.docx
+++ b/shared documentation/API_CONTRACTS.docx
@@ -20,7 +20,7 @@
     </w:p>
     <w:p>
       <w:r>
-        <w:t>Aggiornato al 12/10/2026 (taxation/save-electronic-receipt-account: pin e password null mantengono quelli salvati, come smtpPassword; tolto il tipo ManagementRequest; idProperty fa parte di PageRequest, il corpo di ogni tabella; ogni tabella manda lo stesso corpo: idProperty, page, pageSize, search, filters, sortField, sortDirection; nuovo campo filters, array di { field, value }, [] se non ci sono filtri; warehouse/list non manda più datetimeFrom, datetimeTo e bookingDayType, che torneranno come filters; taxation/printer-list diventa POST con quel corpo e risponde con una pagina (total, rows) invece che con un array; nuova API database/existing-booking-list, la tabella della pagina Database; nuova API taxation/save-electronic-receipt-account, il bottone Salva del form Configurazione account; nuova API taxation/electronic-receipt-activation, il bottone Invia dei termini dello scontrino elettronico; nuova API taxation/add-printer, il bottone Salva del popup "Aggiungi nuova stampante"; in auth/signin e auth/refresh, user ha il nuovo campo isElectronicReceiptAccepted). Prima, il 09/10/2026 (nuova API taxation/download-guide-electronic-receipt, il bottone "Scarica la guida" scarica un file; nuove API taxation/set-is-active, interruttore di una stampante, e taxation/delete-printer, cestino di una stampante; Accept-Language può valere anche zh, cinese semplificato, e ar, arabo). Prima, il 08/10/2026 (Accept-Language può valere anche fr, es, de; nuove API taxation/printer-list e taxation/electronic-receipt per la pagina Fiscalizzazione). Prima, il 07/10/2026 (un id non valido non è mai un errore di campo in errors[]: idProperty dà 403 operation.not_allowed e un articolo inesistente 404 resource.not_found, due codici nuovi, e l'operazione è annullata; warehouse/add-warehouse-item e warehouse/edit-warehouse-item: il corpo è una riga di warehouse/list (WarehouseItem) con idProperty; nella modifica idArticle e totalQuantity sostituiscono idItem e articleQuantity, nell'aggiunta totalQuantity sostituisce articleQuantity; system/email-configuration non restituisce mai la password SMTP ma solo hasSmtpPassword, e in salvataggio e invio di prova smtpPassword null mantiene quella salvata). Prima, il 06/10/2026 (nuova API system/save-email-configuration per il bottone Salva, stesso corpo dell'invio di prova (EmailConfigurationRequest); nuova API system/send-test-email per il bottone Invia email test; nuova API GET system/email-configuration per la pagina Configurazione email; nuova API system/info-support con telefono, email e orari della pagina Assistenza e guide). Prima, il 05/10/2026 (nuova API system/contact-support per il form della pagina Assistenza e guide; nuova API warehouse/duplicate-warehouse-item, stessa forma dell'eliminazione, nomi delle copie scelti dal backend; nuova API warehouse/delete-warehouse-item, un solo id o più id insieme, tutto o niente; in warehouse/list i campi delle quantità finiscono con Quantity: totalQuantity, availableQuantity e thresholdQuantity, prima total, available e thresholdNumber; nuova API warehouse/edit-warehouse-item per il popup "Modifica articolo" e, in warehouse/list, nuovo campo isThresholdWarningActive; quantità sempre maggiore di 0; nuova API warehouse/add-warehouse-item per il bottone Aggiungi del popup "Aggiungi articolo"; nuova API warehouse/combobox-list per la tendina degli articoli; in warehouse/list availableQuantity e thresholdQuantity sempre presenti). Prima, il 01/10/2026 (errori: formato Problem Details con code, errori possibili per API e catalogo dei codici; header Accept-Language; formato dei valori in args). Oggi tutte le API sono simulate dai mock del frontend (services/mocks).</w:t>
+        <w:t>Aggiornato al 13/10/2026 (nuova API database/get-affiliated-hotel-combobox, la tendina Strutture convenzionate; voci vere dei filtri del popup Filtri, Strutture convenzionate come idAffiliatedHotel; database/existing-booking-list: il periodo scelto nella pagina arriva in filters come datetimeFrom e datetimeTo; i filtri del popup Filtri arrivano in filters, un oggetto per valore scelto, con field bookingTypology, agreementBooking, idAffiliatedHotel e paymentStatus). Prima, il 12/10/2026 (taxation/save-electronic-receipt-account: pin e password null mantengono quelli salvati, come smtpPassword; tolto il tipo ManagementRequest; idProperty fa parte di PageRequest, il corpo di ogni tabella; ogni tabella manda lo stesso corpo: idProperty, page, pageSize, search, filters, sortField, sortDirection; nuovo campo filters, array di { field, value }, [] se non ci sono filtri; warehouse/list non manda più datetimeFrom, datetimeTo e bookingDayType, che torneranno come filters; taxation/printer-list diventa POST con quel corpo e risponde con una pagina (total, rows) invece che con un array; nuova API database/existing-booking-list, la tabella della pagina Database; nuova API taxation/save-electronic-receipt-account, il bottone Salva del form Configurazione account; nuova API taxation/electronic-receipt-activation, il bottone Invia dei termini dello scontrino elettronico; nuova API taxation/add-printer, il bottone Salva del popup "Aggiungi nuova stampante"; in auth/signin e auth/refresh, user ha il nuovo campo isElectronicReceiptAccepted). Prima, il 09/10/2026 (nuova API taxation/download-guide-electronic-receipt, il bottone "Scarica la guida" scarica un file; nuove API taxation/set-is-active, interruttore di una stampante, e taxation/delete-printer, cestino di una stampante; Accept-Language può valere anche zh, cinese semplificato, e ar, arabo). Prima, il 08/10/2026 (Accept-Language può valere anche fr, es, de; nuove API taxation/printer-list e taxation/electronic-receipt per la pagina Fiscalizzazione). Prima, il 07/10/2026 (un id non valido non è mai un errore di campo in errors[]: idProperty dà 403 operation.not_allowed e un articolo inesistente 404 resource.not_found, due codici nuovi, e l'operazione è annullata; warehouse/add-warehouse-item e warehouse/edit-warehouse-item: il corpo è una riga di warehouse/list (WarehouseItem) con idProperty; nella modifica idArticle e totalQuantity sostituiscono idItem e articleQuantity, nell'aggiunta totalQuantity sostituisce articleQuantity; system/email-configuration non restituisce mai la password SMTP ma solo hasSmtpPassword, e in salvataggio e invio di prova smtpPassword null mantiene quella salvata). Prima, il 06/10/2026 (nuova API system/save-email-configuration per il bottone Salva, stesso corpo dell'invio di prova (EmailConfigurationRequest); nuova API system/send-test-email per il bottone Invia email test; nuova API GET system/email-configuration per la pagina Configurazione email; nuova API system/info-support con telefono, email e orari della pagina Assistenza e guide). Prima, il 05/10/2026 (nuova API system/contact-support per il form della pagina Assistenza e guide; nuova API warehouse/duplicate-warehouse-item, stessa forma dell'eliminazione, nomi delle copie scelti dal backend; nuova API warehouse/delete-warehouse-item, un solo id o più id insieme, tutto o niente; in warehouse/list i campi delle quantità finiscono con Quantity: totalQuantity, availableQuantity e thresholdQuantity, prima total, available e thresholdNumber; nuova API warehouse/edit-warehouse-item per il popup "Modifica articolo" e, in warehouse/list, nuovo campo isThresholdWarningActive; quantità sempre maggiore di 0; nuova API warehouse/add-warehouse-item per il bottone Aggiungi del popup "Aggiungi articolo"; nuova API warehouse/combobox-list per la tendina degli articoli; in warehouse/list availableQuantity e thresholdQuantity sempre presenti). Prima, il 01/10/2026 (errori: formato Problem Details con code, errori possibili per API e catalogo dei codici; header Accept-Language; formato dei valori in args). Oggi tutte le API sono simulate dai mock del frontend (services/mocks).</w:t>
       </w:r>
     </w:p>
     <w:p>
@@ -3332,6 +3332,69 @@
           </w:p>
         </w:tc>
       </w:tr>
+      <w:tr>
+        <w:trPr>
+          <w:cantSplit w:val="true"/>
+        </w:trPr>
+        <w:tc>
+          <w:tcPr>
+            <w:tcW w:type="dxa" w:w="2381"/>
+            <w:shd w:val="clear" w:color="auto" w:fill="F1F3F8"/>
+          </w:tcPr>
+          <w:p>
+            <w:pPr>
+              <w:spacing w:after="0"/>
+            </w:pPr>
+            <w:r>
+              <w:rPr>
+                <w:rFonts w:ascii="Consolas" w:hAnsi="Consolas"/>
+                <w:b w:val="0"/>
+                <w:color w:val="233C7D"/>
+                <w:sz w:val="19"/>
+              </w:rPr>
+              <w:t>POST</w:t>
+            </w:r>
+          </w:p>
+        </w:tc>
+        <w:tc>
+          <w:tcPr>
+            <w:tcW w:type="dxa" w:w="2608"/>
+            <w:shd w:val="clear" w:color="auto" w:fill="F1F3F8"/>
+          </w:tcPr>
+          <w:p>
+            <w:pPr>
+              <w:spacing w:after="0"/>
+            </w:pPr>
+            <w:r>
+              <w:rPr>
+                <w:rFonts w:ascii="Consolas" w:hAnsi="Consolas"/>
+                <w:b w:val="0"/>
+                <w:color w:val="233C7D"/>
+                <w:sz w:val="19"/>
+              </w:rPr>
+              <w:t>/api/database/get-affiliated-hotel-combobox</w:t>
+            </w:r>
+          </w:p>
+        </w:tc>
+        <w:tc>
+          <w:tcPr>
+            <w:tcW w:type="dxa" w:w="4876"/>
+            <w:shd w:val="clear" w:color="auto" w:fill="F1F3F8"/>
+          </w:tcPr>
+          <w:p>
+            <w:pPr>
+              <w:spacing w:after="0"/>
+            </w:pPr>
+            <w:r>
+              <w:rPr>
+                <w:b w:val="0"/>
+                <w:sz w:val="19"/>
+              </w:rPr>
+              <w:t>Database: hotel convenzionati per la tendina</w:t>
+            </w:r>
+          </w:p>
+        </w:tc>
+      </w:tr>
     </w:tbl>
     <w:p>
       <w:pPr>
@@ -8549,7 +8612,7 @@
                 <w:b w:val="0"/>
                 <w:sz w:val="19"/>
               </w:rPr>
-              <w:t>Filtri composti dalla pagina, uno per oggetto; [] se non ce ne sono (oggi sempre [] in tutte le tabelle). C'è sempre, anche vuoto. Quando torneranno i filtri dell'header saranno datetimeFrom, datetimeTo e bookingDayType.</w:t>
+              <w:t>Filtri composti dalla pagina, uno per oggetto; [] se non ce ne sono. C'è sempre, anche vuoto. Oggi li usa solo la pagina Database (datetimeFrom e datetimeTo del periodo scelto, bookingTypology, agreementBooking, idAffiliatedHotel e paymentStatus del popup Filtri); più oggetti con lo stesso field sono alternative (basta che la riga ne rispetti uno), field diversi valgono tutti insieme; quando torneranno i filtri dell'header saranno datetimeFrom, datetimeTo e bookingDayType.</w:t>
             </w:r>
           </w:p>
         </w:tc>
@@ -24348,7 +24411,7 @@
                 <w:b w:val="0"/>
                 <w:sz w:val="19"/>
               </w:rPr>
-              <w:t>Filtri composti dalla pagina, uno per oggetto; [] se non ce ne sono (oggi sempre [] in tutte le tabelle). C'è sempre, anche vuoto. Quando torneranno i filtri dell'header saranno datetimeFrom, datetimeTo e bookingDayType.</w:t>
+              <w:t>Filtri composti dalla pagina, uno per oggetto; [] se non ce ne sono. C'è sempre, anche vuoto. Oggi li usa solo la pagina Database (datetimeFrom e datetimeTo del periodo scelto, bookingTypology, agreementBooking, idAffiliatedHotel e paymentStatus del popup Filtri); più oggetti con lo stesso field sono alternative (basta che la riga ne rispetti uno), field diversi valgono tutti insieme; quando torneranno i filtri dell'header saranno datetimeFrom, datetimeTo e bookingDayType.</w:t>
             </w:r>
           </w:p>
         </w:tc>
@@ -34906,6 +34969,22 @@
         <w:pStyle w:val="ListBullet"/>
       </w:pPr>
       <w:r>
+        <w:t>Il periodo scelto a sinistra della ricerca ("Tutte le date", Oggi, Questa settimana, Prossimi sette giorni, Prossimo mese, Prossimi sei mesi, o un intervallo dal calendario) arriva in filters come datetimeFrom (mezzanotte UTC del primo giorno) e datetimeTo (23:59:59.999 UTC dell'ultimo). Le date delle voci le calcola il frontend: Questa settimana = da lunedì a domenica; Prossimi sette giorni = da lunedì a domenica della settimana dopo; Prossimo mese = tutto il mese successivo; Prossimi sei mesi = i sei mesi interi a partire dal successivo. Con "Tutte le date" filters è []. Una prenotazione rientra nel periodo se almeno uno dei suoi giorni ci cade (così fa il mock).</w:t>
+      </w:r>
+    </w:p>
+    <w:p>
+      <w:pPr>
+        <w:pStyle w:val="ListBullet"/>
+      </w:pPr>
+      <w:r>
+        <w:t>Il bottone Filtri apre un popup con quattro tendine a scelta multipla: Tipologia prenotazioni (field bookingTypology: Daily, MultiDay, SevenDays, FourteenDays, Monthly, Seasonal = Giornaliera, Più giorni, 7 giorni, 14 giorni, Mensile, Stagionale), Prenotazioni con convenzioni (agreementBooking: Yes, No), Strutture convenzionate (idAffiliatedHotel: l'id di un hotel di database/get-affiliated-hotel-combobox), Stato pagamento (paymentStatus: AwaitingPayment, FullyPaid, PartiallyPaid = In attesa di pagamento, Pagato totalmente, Pagato parzialmente). Con Applica ogni valore scelto diventa un oggetto di filters (es. due tipologie = due oggetti con field bookingTypology), e la tabella torna a pagina 1; Annulla non cambia nulla. Valori degli enum e nomi dei field sono una proposta del frontend, con i nomi .NET; il backend li controllerà. Il mock non li applica.</w:t>
+      </w:r>
+    </w:p>
+    <w:p>
+      <w:pPr>
+        <w:pStyle w:val="ListBullet"/>
+      </w:pPr>
+      <w:r>
         <w:t>Nomi dei campi ed enum delle righe sono una proposta del frontend, presa dalla struttura di booking.reservations, da confermare col backend. Le colonne ordinabili sono tutte e sei.</w:t>
       </w:r>
     </w:p>
@@ -35327,7 +35406,7 @@
                 <w:b w:val="0"/>
                 <w:sz w:val="19"/>
               </w:rPr>
-              <w:t>Filtri composti dalla pagina, uno per oggetto; [] se non ce ne sono (oggi sempre [] in tutte le tabelle). C'è sempre, anche vuoto. Quando torneranno i filtri dell'header saranno datetimeFrom, datetimeTo e bookingDayType.</w:t>
+              <w:t>Filtri composti dalla pagina, uno per oggetto; [] se non ce ne sono. C'è sempre, anche vuoto. Oggi li usa solo la pagina Database (datetimeFrom e datetimeTo del periodo scelto, bookingTypology, agreementBooking, idAffiliatedHotel e paymentStatus del popup Filtri); più oggetti con lo stesso field sono alternative (basta che la riga ne rispetti uno), field diversi valgono tutti insieme; quando torneranno i filtri dell'header saranno datetimeFrom, datetimeTo e bookingDayType.</w:t>
             </w:r>
           </w:p>
         </w:tc>
@@ -35792,7 +35871,279 @@
           <w:color w:val="233C7D"/>
           <w:sz w:val="19"/>
         </w:rPr>
-        <w:t xml:space="preserve">  "filters": [],</w:t>
+        <w:t xml:space="preserve">  "filters": [</w:t>
+      </w:r>
+    </w:p>
+    <w:p>
+      <w:pPr>
+        <w:keepNext/>
+        <w:spacing w:after="0"/>
+        <w:shd w:val="clear" w:color="auto" w:fill="F1F3F8"/>
+      </w:pPr>
+      <w:r>
+        <w:rPr>
+          <w:rFonts w:ascii="Consolas" w:hAnsi="Consolas"/>
+          <w:b w:val="0"/>
+          <w:color w:val="233C7D"/>
+          <w:sz w:val="19"/>
+        </w:rPr>
+        <w:t xml:space="preserve">    {</w:t>
+      </w:r>
+    </w:p>
+    <w:p>
+      <w:pPr>
+        <w:keepNext/>
+        <w:spacing w:after="0"/>
+        <w:shd w:val="clear" w:color="auto" w:fill="F1F3F8"/>
+      </w:pPr>
+      <w:r>
+        <w:rPr>
+          <w:rFonts w:ascii="Consolas" w:hAnsi="Consolas"/>
+          <w:b w:val="0"/>
+          <w:color w:val="233C7D"/>
+          <w:sz w:val="19"/>
+        </w:rPr>
+        <w:t xml:space="preserve">      "field": "datetimeFrom",</w:t>
+      </w:r>
+    </w:p>
+    <w:p>
+      <w:pPr>
+        <w:keepNext/>
+        <w:spacing w:after="0"/>
+        <w:shd w:val="clear" w:color="auto" w:fill="F1F3F8"/>
+      </w:pPr>
+      <w:r>
+        <w:rPr>
+          <w:rFonts w:ascii="Consolas" w:hAnsi="Consolas"/>
+          <w:b w:val="0"/>
+          <w:color w:val="233C7D"/>
+          <w:sz w:val="19"/>
+        </w:rPr>
+        <w:t xml:space="preserve">      "value": "2026-07-01T00:00:00.000Z"</w:t>
+      </w:r>
+    </w:p>
+    <w:p>
+      <w:pPr>
+        <w:keepNext/>
+        <w:spacing w:after="0"/>
+        <w:shd w:val="clear" w:color="auto" w:fill="F1F3F8"/>
+      </w:pPr>
+      <w:r>
+        <w:rPr>
+          <w:rFonts w:ascii="Consolas" w:hAnsi="Consolas"/>
+          <w:b w:val="0"/>
+          <w:color w:val="233C7D"/>
+          <w:sz w:val="19"/>
+        </w:rPr>
+        <w:t xml:space="preserve">    },</w:t>
+      </w:r>
+    </w:p>
+    <w:p>
+      <w:pPr>
+        <w:keepNext/>
+        <w:spacing w:after="0"/>
+        <w:shd w:val="clear" w:color="auto" w:fill="F1F3F8"/>
+      </w:pPr>
+      <w:r>
+        <w:rPr>
+          <w:rFonts w:ascii="Consolas" w:hAnsi="Consolas"/>
+          <w:b w:val="0"/>
+          <w:color w:val="233C7D"/>
+          <w:sz w:val="19"/>
+        </w:rPr>
+        <w:t xml:space="preserve">    {</w:t>
+      </w:r>
+    </w:p>
+    <w:p>
+      <w:pPr>
+        <w:keepNext/>
+        <w:spacing w:after="0"/>
+        <w:shd w:val="clear" w:color="auto" w:fill="F1F3F8"/>
+      </w:pPr>
+      <w:r>
+        <w:rPr>
+          <w:rFonts w:ascii="Consolas" w:hAnsi="Consolas"/>
+          <w:b w:val="0"/>
+          <w:color w:val="233C7D"/>
+          <w:sz w:val="19"/>
+        </w:rPr>
+        <w:t xml:space="preserve">      "field": "datetimeTo",</w:t>
+      </w:r>
+    </w:p>
+    <w:p>
+      <w:pPr>
+        <w:keepNext/>
+        <w:spacing w:after="0"/>
+        <w:shd w:val="clear" w:color="auto" w:fill="F1F3F8"/>
+      </w:pPr>
+      <w:r>
+        <w:rPr>
+          <w:rFonts w:ascii="Consolas" w:hAnsi="Consolas"/>
+          <w:b w:val="0"/>
+          <w:color w:val="233C7D"/>
+          <w:sz w:val="19"/>
+        </w:rPr>
+        <w:t xml:space="preserve">      "value": "2026-08-31T23:59:59.999Z"</w:t>
+      </w:r>
+    </w:p>
+    <w:p>
+      <w:pPr>
+        <w:keepNext/>
+        <w:spacing w:after="0"/>
+        <w:shd w:val="clear" w:color="auto" w:fill="F1F3F8"/>
+      </w:pPr>
+      <w:r>
+        <w:rPr>
+          <w:rFonts w:ascii="Consolas" w:hAnsi="Consolas"/>
+          <w:b w:val="0"/>
+          <w:color w:val="233C7D"/>
+          <w:sz w:val="19"/>
+        </w:rPr>
+        <w:t xml:space="preserve">    },</w:t>
+      </w:r>
+    </w:p>
+    <w:p>
+      <w:pPr>
+        <w:keepNext/>
+        <w:spacing w:after="0"/>
+        <w:shd w:val="clear" w:color="auto" w:fill="F1F3F8"/>
+      </w:pPr>
+      <w:r>
+        <w:rPr>
+          <w:rFonts w:ascii="Consolas" w:hAnsi="Consolas"/>
+          <w:b w:val="0"/>
+          <w:color w:val="233C7D"/>
+          <w:sz w:val="19"/>
+        </w:rPr>
+        <w:t xml:space="preserve">    {</w:t>
+      </w:r>
+    </w:p>
+    <w:p>
+      <w:pPr>
+        <w:keepNext/>
+        <w:spacing w:after="0"/>
+        <w:shd w:val="clear" w:color="auto" w:fill="F1F3F8"/>
+      </w:pPr>
+      <w:r>
+        <w:rPr>
+          <w:rFonts w:ascii="Consolas" w:hAnsi="Consolas"/>
+          <w:b w:val="0"/>
+          <w:color w:val="233C7D"/>
+          <w:sz w:val="19"/>
+        </w:rPr>
+        <w:t xml:space="preserve">      "field": "paymentStatus",</w:t>
+      </w:r>
+    </w:p>
+    <w:p>
+      <w:pPr>
+        <w:keepNext/>
+        <w:spacing w:after="0"/>
+        <w:shd w:val="clear" w:color="auto" w:fill="F1F3F8"/>
+      </w:pPr>
+      <w:r>
+        <w:rPr>
+          <w:rFonts w:ascii="Consolas" w:hAnsi="Consolas"/>
+          <w:b w:val="0"/>
+          <w:color w:val="233C7D"/>
+          <w:sz w:val="19"/>
+        </w:rPr>
+        <w:t xml:space="preserve">      "value": "FullyPaid"</w:t>
+      </w:r>
+    </w:p>
+    <w:p>
+      <w:pPr>
+        <w:keepNext/>
+        <w:spacing w:after="0"/>
+        <w:shd w:val="clear" w:color="auto" w:fill="F1F3F8"/>
+      </w:pPr>
+      <w:r>
+        <w:rPr>
+          <w:rFonts w:ascii="Consolas" w:hAnsi="Consolas"/>
+          <w:b w:val="0"/>
+          <w:color w:val="233C7D"/>
+          <w:sz w:val="19"/>
+        </w:rPr>
+        <w:t xml:space="preserve">    },</w:t>
+      </w:r>
+    </w:p>
+    <w:p>
+      <w:pPr>
+        <w:keepNext/>
+        <w:spacing w:after="0"/>
+        <w:shd w:val="clear" w:color="auto" w:fill="F1F3F8"/>
+      </w:pPr>
+      <w:r>
+        <w:rPr>
+          <w:rFonts w:ascii="Consolas" w:hAnsi="Consolas"/>
+          <w:b w:val="0"/>
+          <w:color w:val="233C7D"/>
+          <w:sz w:val="19"/>
+        </w:rPr>
+        <w:t xml:space="preserve">    {</w:t>
+      </w:r>
+    </w:p>
+    <w:p>
+      <w:pPr>
+        <w:keepNext/>
+        <w:spacing w:after="0"/>
+        <w:shd w:val="clear" w:color="auto" w:fill="F1F3F8"/>
+      </w:pPr>
+      <w:r>
+        <w:rPr>
+          <w:rFonts w:ascii="Consolas" w:hAnsi="Consolas"/>
+          <w:b w:val="0"/>
+          <w:color w:val="233C7D"/>
+          <w:sz w:val="19"/>
+        </w:rPr>
+        <w:t xml:space="preserve">      "field": "paymentStatus",</w:t>
+      </w:r>
+    </w:p>
+    <w:p>
+      <w:pPr>
+        <w:keepNext/>
+        <w:spacing w:after="0"/>
+        <w:shd w:val="clear" w:color="auto" w:fill="F1F3F8"/>
+      </w:pPr>
+      <w:r>
+        <w:rPr>
+          <w:rFonts w:ascii="Consolas" w:hAnsi="Consolas"/>
+          <w:b w:val="0"/>
+          <w:color w:val="233C7D"/>
+          <w:sz w:val="19"/>
+        </w:rPr>
+        <w:t xml:space="preserve">      "value": "PartiallyPaid"</w:t>
+      </w:r>
+    </w:p>
+    <w:p>
+      <w:pPr>
+        <w:keepNext/>
+        <w:spacing w:after="0"/>
+        <w:shd w:val="clear" w:color="auto" w:fill="F1F3F8"/>
+      </w:pPr>
+      <w:r>
+        <w:rPr>
+          <w:rFonts w:ascii="Consolas" w:hAnsi="Consolas"/>
+          <w:b w:val="0"/>
+          <w:color w:val="233C7D"/>
+          <w:sz w:val="19"/>
+        </w:rPr>
+        <w:t xml:space="preserve">    }</w:t>
+      </w:r>
+    </w:p>
+    <w:p>
+      <w:pPr>
+        <w:keepNext/>
+        <w:spacing w:after="0"/>
+        <w:shd w:val="clear" w:color="auto" w:fill="F1F3F8"/>
+      </w:pPr>
+      <w:r>
+        <w:rPr>
+          <w:rFonts w:ascii="Consolas" w:hAnsi="Consolas"/>
+          <w:b w:val="0"/>
+          <w:color w:val="233C7D"/>
+          <w:sz w:val="19"/>
+        </w:rPr>
+        <w:t xml:space="preserve">  ],</w:t>
       </w:r>
     </w:p>
     <w:p>
@@ -37016,6 +37367,1326 @@
           <w:sz w:val="19"/>
         </w:rPr>
         <w:t>}</w:t>
+      </w:r>
+    </w:p>
+    <w:p>
+      <w:pPr>
+        <w:pStyle w:val="Heading2"/>
+      </w:pPr>
+      <w:r>
+        <w:t>Errori possibili</w:t>
+      </w:r>
+    </w:p>
+    <w:tbl>
+      <w:tblPr>
+        <w:tblW w:type="auto" w:w="0"/>
+        <w:jc w:val="center"/>
+        <w:tblLayout w:type="fixed"/>
+        <w:tblLook w:firstColumn="1" w:firstRow="1" w:lastColumn="0" w:lastRow="0" w:noHBand="0" w:noVBand="1" w:val="04A0"/>
+        <w:tblBorders>
+          <w:top w:val="single" w:sz="4" w:color="C9CED8"/>
+          <w:left w:val="single" w:sz="4" w:color="C9CED8"/>
+          <w:bottom w:val="single" w:sz="4" w:color="C9CED8"/>
+          <w:right w:val="single" w:sz="4" w:color="C9CED8"/>
+          <w:insideH w:val="single" w:sz="4" w:color="C9CED8"/>
+          <w:insideV w:val="single" w:sz="4" w:color="C9CED8"/>
+        </w:tblBorders>
+      </w:tblPr>
+      <w:tblGrid>
+        <w:gridCol w:w="3289"/>
+        <w:gridCol w:w="3289"/>
+        <w:gridCol w:w="3289"/>
+      </w:tblGrid>
+      <w:tr>
+        <w:trPr>
+          <w:cantSplit w:val="true"/>
+          <w:tblHeader w:val="true"/>
+        </w:trPr>
+        <w:tc>
+          <w:tcPr>
+            <w:tcW w:type="dxa" w:w="907"/>
+            <w:shd w:val="clear" w:color="auto" w:fill="233C7D"/>
+          </w:tcPr>
+          <w:p>
+            <w:pPr>
+              <w:spacing w:after="0"/>
+            </w:pPr>
+            <w:r>
+              <w:rPr>
+                <w:b/>
+                <w:color w:val="FFFFFF"/>
+                <w:sz w:val="20"/>
+              </w:rPr>
+              <w:t>Status</w:t>
+            </w:r>
+          </w:p>
+        </w:tc>
+        <w:tc>
+          <w:tcPr>
+            <w:tcW w:type="dxa" w:w="3061"/>
+            <w:shd w:val="clear" w:color="auto" w:fill="233C7D"/>
+          </w:tcPr>
+          <w:p>
+            <w:pPr>
+              <w:spacing w:after="0"/>
+            </w:pPr>
+            <w:r>
+              <w:rPr>
+                <w:b/>
+                <w:color w:val="FFFFFF"/>
+                <w:sz w:val="20"/>
+              </w:rPr>
+              <w:t>Codice</w:t>
+            </w:r>
+          </w:p>
+        </w:tc>
+        <w:tc>
+          <w:tcPr>
+            <w:tcW w:type="dxa" w:w="5896"/>
+            <w:shd w:val="clear" w:color="auto" w:fill="233C7D"/>
+          </w:tcPr>
+          <w:p>
+            <w:pPr>
+              <w:spacing w:after="0"/>
+            </w:pPr>
+            <w:r>
+              <w:rPr>
+                <w:b/>
+                <w:color w:val="FFFFFF"/>
+                <w:sz w:val="20"/>
+              </w:rPr>
+              <w:t>Quando</w:t>
+            </w:r>
+          </w:p>
+        </w:tc>
+      </w:tr>
+      <w:tr>
+        <w:trPr>
+          <w:cantSplit w:val="true"/>
+        </w:trPr>
+        <w:tc>
+          <w:tcPr>
+            <w:tcW w:type="dxa" w:w="907"/>
+          </w:tcPr>
+          <w:p>
+            <w:pPr>
+              <w:spacing w:after="0"/>
+            </w:pPr>
+            <w:r>
+              <w:rPr>
+                <w:rFonts w:ascii="Consolas" w:hAnsi="Consolas"/>
+                <w:b w:val="0"/>
+                <w:color w:val="233C7D"/>
+                <w:sz w:val="19"/>
+              </w:rPr>
+              <w:t>403</w:t>
+            </w:r>
+          </w:p>
+        </w:tc>
+        <w:tc>
+          <w:tcPr>
+            <w:tcW w:type="dxa" w:w="3061"/>
+          </w:tcPr>
+          <w:p>
+            <w:pPr>
+              <w:spacing w:after="0"/>
+            </w:pPr>
+            <w:r>
+              <w:rPr>
+                <w:rFonts w:ascii="Consolas" w:hAnsi="Consolas"/>
+                <w:b w:val="0"/>
+                <w:color w:val="233C7D"/>
+                <w:sz w:val="19"/>
+              </w:rPr>
+              <w:t>operation.not_allowed</w:t>
+            </w:r>
+          </w:p>
+        </w:tc>
+        <w:tc>
+          <w:tcPr>
+            <w:tcW w:type="dxa" w:w="5896"/>
+          </w:tcPr>
+          <w:p>
+            <w:pPr>
+              <w:spacing w:after="0"/>
+            </w:pPr>
+            <w:r>
+              <w:rPr>
+                <w:b w:val="0"/>
+                <w:sz w:val="19"/>
+              </w:rPr>
+              <w:t>idProperty assente, sconosciuto o non dell'utente: l'operazione è annullata, senza errors[].</w:t>
+            </w:r>
+          </w:p>
+        </w:tc>
+      </w:tr>
+      <w:tr>
+        <w:trPr>
+          <w:cantSplit w:val="true"/>
+        </w:trPr>
+        <w:tc>
+          <w:tcPr>
+            <w:tcW w:type="dxa" w:w="907"/>
+            <w:shd w:val="clear" w:color="auto" w:fill="F1F3F8"/>
+          </w:tcPr>
+          <w:p>
+            <w:pPr>
+              <w:spacing w:after="0"/>
+            </w:pPr>
+            <w:r>
+              <w:rPr>
+                <w:rFonts w:ascii="Consolas" w:hAnsi="Consolas"/>
+                <w:b w:val="0"/>
+                <w:color w:val="233C7D"/>
+                <w:sz w:val="19"/>
+              </w:rPr>
+              <w:t>401</w:t>
+            </w:r>
+          </w:p>
+        </w:tc>
+        <w:tc>
+          <w:tcPr>
+            <w:tcW w:type="dxa" w:w="3061"/>
+            <w:shd w:val="clear" w:color="auto" w:fill="F1F3F8"/>
+          </w:tcPr>
+          <w:p>
+            <w:pPr>
+              <w:spacing w:after="0"/>
+            </w:pPr>
+            <w:r>
+              <w:rPr>
+                <w:rFonts w:ascii="Consolas" w:hAnsi="Consolas"/>
+                <w:b w:val="0"/>
+                <w:color w:val="233C7D"/>
+                <w:sz w:val="19"/>
+              </w:rPr>
+              <w:t>auth.invalid_token</w:t>
+            </w:r>
+          </w:p>
+        </w:tc>
+        <w:tc>
+          <w:tcPr>
+            <w:tcW w:type="dxa" w:w="5896"/>
+            <w:shd w:val="clear" w:color="auto" w:fill="F1F3F8"/>
+          </w:tcPr>
+          <w:p>
+            <w:pPr>
+              <w:spacing w:after="0"/>
+            </w:pPr>
+            <w:r>
+              <w:rPr>
+                <w:b w:val="0"/>
+                <w:sz w:val="19"/>
+              </w:rPr>
+              <w:t>Access token assente, scaduto o non valido: il frontend rinnova il token e ripete la chiamata una volta.</w:t>
+            </w:r>
+          </w:p>
+        </w:tc>
+      </w:tr>
+      <w:tr>
+        <w:trPr>
+          <w:cantSplit w:val="true"/>
+        </w:trPr>
+        <w:tc>
+          <w:tcPr>
+            <w:tcW w:type="dxa" w:w="907"/>
+          </w:tcPr>
+          <w:p>
+            <w:pPr>
+              <w:spacing w:after="0"/>
+            </w:pPr>
+            <w:r>
+              <w:rPr>
+                <w:rFonts w:ascii="Consolas" w:hAnsi="Consolas"/>
+                <w:b w:val="0"/>
+                <w:color w:val="233C7D"/>
+                <w:sz w:val="19"/>
+              </w:rPr>
+              <w:t>500</w:t>
+            </w:r>
+          </w:p>
+        </w:tc>
+        <w:tc>
+          <w:tcPr>
+            <w:tcW w:type="dxa" w:w="3061"/>
+          </w:tcPr>
+          <w:p>
+            <w:pPr>
+              <w:spacing w:after="0"/>
+            </w:pPr>
+            <w:r>
+              <w:rPr>
+                <w:rFonts w:ascii="Consolas" w:hAnsi="Consolas"/>
+                <w:b w:val="0"/>
+                <w:color w:val="233C7D"/>
+                <w:sz w:val="19"/>
+              </w:rPr>
+              <w:t>server.unexpected</w:t>
+            </w:r>
+          </w:p>
+        </w:tc>
+        <w:tc>
+          <w:tcPr>
+            <w:tcW w:type="dxa" w:w="5896"/>
+          </w:tcPr>
+          <w:p>
+            <w:pPr>
+              <w:spacing w:after="0"/>
+            </w:pPr>
+            <w:r>
+              <w:rPr>
+                <w:b w:val="0"/>
+                <w:sz w:val="19"/>
+              </w:rPr>
+              <w:t>Errore non gestito del server (vale per ogni API).</w:t>
+            </w:r>
+          </w:p>
+        </w:tc>
+      </w:tr>
+    </w:tbl>
+    <w:p>
+      <w:pPr>
+        <w:spacing w:after="40"/>
+      </w:pPr>
+    </w:p>
+    <w:p>
+      <w:pPr>
+        <w:pStyle w:val="Heading3"/>
+      </w:pPr>
+      <w:r>
+        <w:t>Esempio di errore (JSON)</w:t>
+      </w:r>
+    </w:p>
+    <w:p>
+      <w:pPr>
+        <w:keepNext/>
+      </w:pPr>
+      <w:r>
+        <w:t>Risposta a una richiesta con uno stabilimento non valido:</w:t>
+      </w:r>
+    </w:p>
+    <w:p>
+      <w:pPr>
+        <w:keepNext/>
+        <w:spacing w:after="0"/>
+        <w:shd w:val="clear" w:color="auto" w:fill="F1F3F8"/>
+      </w:pPr>
+      <w:r>
+        <w:rPr>
+          <w:rFonts w:ascii="Consolas" w:hAnsi="Consolas"/>
+          <w:b w:val="0"/>
+          <w:color w:val="233C7D"/>
+          <w:sz w:val="19"/>
+        </w:rPr>
+        <w:t>{</w:t>
+      </w:r>
+    </w:p>
+    <w:p>
+      <w:pPr>
+        <w:keepNext/>
+        <w:spacing w:after="0"/>
+        <w:shd w:val="clear" w:color="auto" w:fill="F1F3F8"/>
+      </w:pPr>
+      <w:r>
+        <w:rPr>
+          <w:rFonts w:ascii="Consolas" w:hAnsi="Consolas"/>
+          <w:b w:val="0"/>
+          <w:color w:val="233C7D"/>
+          <w:sz w:val="19"/>
+        </w:rPr>
+        <w:t xml:space="preserve">  "type": "https://errors.summerbooking/operation/not-allowed",</w:t>
+      </w:r>
+    </w:p>
+    <w:p>
+      <w:pPr>
+        <w:keepNext/>
+        <w:spacing w:after="0"/>
+        <w:shd w:val="clear" w:color="auto" w:fill="F1F3F8"/>
+      </w:pPr>
+      <w:r>
+        <w:rPr>
+          <w:rFonts w:ascii="Consolas" w:hAnsi="Consolas"/>
+          <w:b w:val="0"/>
+          <w:color w:val="233C7D"/>
+          <w:sz w:val="19"/>
+        </w:rPr>
+        <w:t xml:space="preserve">  "status": 403,</w:t>
+      </w:r>
+    </w:p>
+    <w:p>
+      <w:pPr>
+        <w:keepNext/>
+        <w:spacing w:after="0"/>
+        <w:shd w:val="clear" w:color="auto" w:fill="F1F3F8"/>
+      </w:pPr>
+      <w:r>
+        <w:rPr>
+          <w:rFonts w:ascii="Consolas" w:hAnsi="Consolas"/>
+          <w:b w:val="0"/>
+          <w:color w:val="233C7D"/>
+          <w:sz w:val="19"/>
+        </w:rPr>
+        <w:t xml:space="preserve">  "code": "operation.not_allowed",</w:t>
+      </w:r>
+    </w:p>
+    <w:p>
+      <w:pPr>
+        <w:keepNext/>
+        <w:spacing w:after="0"/>
+        <w:shd w:val="clear" w:color="auto" w:fill="F1F3F8"/>
+      </w:pPr>
+      <w:r>
+        <w:rPr>
+          <w:rFonts w:ascii="Consolas" w:hAnsi="Consolas"/>
+          <w:b w:val="0"/>
+          <w:color w:val="233C7D"/>
+          <w:sz w:val="19"/>
+        </w:rPr>
+        <w:t xml:space="preserve">  "title": "Operation not allowed",</w:t>
+      </w:r>
+    </w:p>
+    <w:p>
+      <w:pPr>
+        <w:keepNext/>
+        <w:spacing w:after="0"/>
+        <w:shd w:val="clear" w:color="auto" w:fill="F1F3F8"/>
+      </w:pPr>
+      <w:r>
+        <w:rPr>
+          <w:rFonts w:ascii="Consolas" w:hAnsi="Consolas"/>
+          <w:b w:val="0"/>
+          <w:color w:val="233C7D"/>
+          <w:sz w:val="19"/>
+        </w:rPr>
+        <w:t xml:space="preserve">  "traceId": "00-4bf92f3577b34da6a3ce929d0e0e4736-00f067aa0ba902b7-01"</w:t>
+      </w:r>
+    </w:p>
+    <w:p>
+      <w:pPr>
+        <w:keepNext w:val="0"/>
+        <w:spacing w:after="120"/>
+        <w:shd w:val="clear" w:color="auto" w:fill="F1F3F8"/>
+      </w:pPr>
+      <w:r>
+        <w:rPr>
+          <w:rFonts w:ascii="Consolas" w:hAnsi="Consolas"/>
+          <w:b w:val="0"/>
+          <w:color w:val="233C7D"/>
+          <w:sz w:val="19"/>
+        </w:rPr>
+        <w:t>}</w:t>
+      </w:r>
+    </w:p>
+    <w:p>
+      <w:pPr>
+        <w:pStyle w:val="Heading1"/>
+        <w:pageBreakBefore/>
+      </w:pPr>
+      <w:r>
+        <w:rPr>
+          <w:b w:val="0"/>
+        </w:rPr>
+        <w:t xml:space="preserve">POST </w:t>
+      </w:r>
+      <w:r>
+        <w:rPr>
+          <w:rFonts w:ascii="Consolas" w:hAnsi="Consolas"/>
+          <w:b w:val="0"/>
+        </w:rPr>
+        <w:t>/api/database/get-affiliated-hotel-combobox</w:t>
+      </w:r>
+    </w:p>
+    <w:p>
+      <w:r>
+        <w:t>Database: hotel convenzionati per la tendina</w:t>
+      </w:r>
+    </w:p>
+    <w:p>
+      <w:pPr>
+        <w:spacing w:after="40"/>
+      </w:pPr>
+      <w:r>
+        <w:rPr>
+          <w:b/>
+        </w:rPr>
+        <w:t xml:space="preserve">Metodo: </w:t>
+      </w:r>
+      <w:r>
+        <w:rPr>
+          <w:rFonts w:ascii="Consolas" w:hAnsi="Consolas"/>
+          <w:b w:val="0"/>
+          <w:color w:val="233C7D"/>
+        </w:rPr>
+        <w:t>POST</w:t>
+      </w:r>
+    </w:p>
+    <w:p>
+      <w:pPr>
+        <w:spacing w:after="40"/>
+      </w:pPr>
+      <w:r>
+        <w:rPr>
+          <w:b/>
+        </w:rPr>
+        <w:t xml:space="preserve">Route: </w:t>
+      </w:r>
+      <w:r>
+        <w:rPr>
+          <w:rFonts w:ascii="Consolas" w:hAnsi="Consolas"/>
+          <w:b w:val="0"/>
+          <w:color w:val="233C7D"/>
+        </w:rPr>
+        <w:t>/api/database/get-affiliated-hotel-combobox</w:t>
+      </w:r>
+    </w:p>
+    <w:p>
+      <w:pPr>
+        <w:spacing w:after="40"/>
+      </w:pPr>
+      <w:r>
+        <w:rPr>
+          <w:b/>
+        </w:rPr>
+        <w:t xml:space="preserve">Nel frontend: </w:t>
+      </w:r>
+      <w:r>
+        <w:rPr>
+          <w:rFonts w:ascii="Consolas" w:hAnsi="Consolas"/>
+          <w:b w:val="0"/>
+          <w:color w:val="233C7D"/>
+        </w:rPr>
+        <w:t>DatabaseService.affiliatedHotelCombobox</w:t>
+      </w:r>
+    </w:p>
+    <w:p>
+      <w:pPr>
+        <w:spacing w:after="40"/>
+      </w:pPr>
+      <w:r>
+        <w:rPr>
+          <w:b/>
+        </w:rPr>
+        <w:t xml:space="preserve">Autenticazione: </w:t>
+      </w:r>
+      <w:r>
+        <w:rPr>
+          <w:b w:val="0"/>
+        </w:rPr>
+        <w:t>Header Authorization: Bearer &lt;accessToken&gt;.</w:t>
+      </w:r>
+    </w:p>
+    <w:p>
+      <w:pPr>
+        <w:pStyle w:val="ListBullet"/>
+      </w:pPr>
+      <w:r>
+        <w:t>Serve alla tendina "Strutture convenzionate" del popup Filtri della pagina Database, che la richiede a ogni apertura (una risposta in ritardo di un'apertura precedente viene ignorata).</w:t>
+      </w:r>
+    </w:p>
+    <w:p>
+      <w:pPr>
+        <w:pStyle w:val="ListBullet"/>
+      </w:pPr>
+      <w:r>
+        <w:t>Rotta data dall'utente; metodo POST e corpo { idProperty } sono una proposta del frontend, come per warehouse/combobox-list: da confermare col backend.</w:t>
+      </w:r>
+    </w:p>
+    <w:p>
+      <w:pPr>
+        <w:pStyle w:val="ListBullet"/>
+      </w:pPr>
+      <w:r>
+        <w:t>Nessuna paginazione: la risposta è l'elenco completo degli hotel convenzionati dello stabilimento. Se la chiamata fallisce la tendina resta vuota.</w:t>
+      </w:r>
+    </w:p>
+    <w:p>
+      <w:pPr>
+        <w:pStyle w:val="Heading2"/>
+      </w:pPr>
+      <w:r>
+        <w:t>Payload inviato al backend</w:t>
+      </w:r>
+    </w:p>
+    <w:p>
+      <w:pPr>
+        <w:pStyle w:val="Heading3"/>
+      </w:pPr>
+      <w:r>
+        <w:rPr>
+          <w:b w:val="0"/>
+        </w:rPr>
+        <w:t xml:space="preserve">Corpo JSON: </w:t>
+      </w:r>
+      <w:r>
+        <w:rPr>
+          <w:rFonts w:ascii="Consolas" w:hAnsi="Consolas"/>
+          <w:b w:val="0"/>
+        </w:rPr>
+        <w:t>{ idProperty }</w:t>
+      </w:r>
+    </w:p>
+    <w:tbl>
+      <w:tblPr>
+        <w:tblW w:type="auto" w:w="0"/>
+        <w:jc w:val="center"/>
+        <w:tblLayout w:type="fixed"/>
+        <w:tblLook w:firstColumn="1" w:firstRow="1" w:lastColumn="0" w:lastRow="0" w:noHBand="0" w:noVBand="1" w:val="04A0"/>
+        <w:tblBorders>
+          <w:top w:val="single" w:sz="4" w:color="C9CED8"/>
+          <w:left w:val="single" w:sz="4" w:color="C9CED8"/>
+          <w:bottom w:val="single" w:sz="4" w:color="C9CED8"/>
+          <w:right w:val="single" w:sz="4" w:color="C9CED8"/>
+          <w:insideH w:val="single" w:sz="4" w:color="C9CED8"/>
+          <w:insideV w:val="single" w:sz="4" w:color="C9CED8"/>
+        </w:tblBorders>
+      </w:tblPr>
+      <w:tblGrid>
+        <w:gridCol w:w="3289"/>
+        <w:gridCol w:w="3289"/>
+        <w:gridCol w:w="3289"/>
+      </w:tblGrid>
+      <w:tr>
+        <w:trPr>
+          <w:cantSplit w:val="true"/>
+          <w:tblHeader w:val="true"/>
+        </w:trPr>
+        <w:tc>
+          <w:tcPr>
+            <w:tcW w:type="dxa" w:w="2381"/>
+            <w:shd w:val="clear" w:color="auto" w:fill="233C7D"/>
+          </w:tcPr>
+          <w:p>
+            <w:pPr>
+              <w:spacing w:after="0"/>
+            </w:pPr>
+            <w:r>
+              <w:rPr>
+                <w:b/>
+                <w:color w:val="FFFFFF"/>
+                <w:sz w:val="20"/>
+              </w:rPr>
+              <w:t>Parametro</w:t>
+            </w:r>
+          </w:p>
+        </w:tc>
+        <w:tc>
+          <w:tcPr>
+            <w:tcW w:type="dxa" w:w="2608"/>
+            <w:shd w:val="clear" w:color="auto" w:fill="233C7D"/>
+          </w:tcPr>
+          <w:p>
+            <w:pPr>
+              <w:spacing w:after="0"/>
+            </w:pPr>
+            <w:r>
+              <w:rPr>
+                <w:b/>
+                <w:color w:val="FFFFFF"/>
+                <w:sz w:val="20"/>
+              </w:rPr>
+              <w:t>Tipo</w:t>
+            </w:r>
+          </w:p>
+        </w:tc>
+        <w:tc>
+          <w:tcPr>
+            <w:tcW w:type="dxa" w:w="4876"/>
+            <w:shd w:val="clear" w:color="auto" w:fill="233C7D"/>
+          </w:tcPr>
+          <w:p>
+            <w:pPr>
+              <w:spacing w:after="0"/>
+            </w:pPr>
+            <w:r>
+              <w:rPr>
+                <w:b/>
+                <w:color w:val="FFFFFF"/>
+                <w:sz w:val="20"/>
+              </w:rPr>
+              <w:t>Descrizione</w:t>
+            </w:r>
+          </w:p>
+        </w:tc>
+      </w:tr>
+      <w:tr>
+        <w:trPr>
+          <w:cantSplit w:val="true"/>
+        </w:trPr>
+        <w:tc>
+          <w:tcPr>
+            <w:tcW w:type="dxa" w:w="2381"/>
+          </w:tcPr>
+          <w:p>
+            <w:pPr>
+              <w:spacing w:after="0"/>
+            </w:pPr>
+            <w:r>
+              <w:rPr>
+                <w:rFonts w:ascii="Consolas" w:hAnsi="Consolas"/>
+                <w:b w:val="0"/>
+                <w:color w:val="233C7D"/>
+                <w:sz w:val="19"/>
+              </w:rPr>
+              <w:t>idProperty</w:t>
+            </w:r>
+          </w:p>
+        </w:tc>
+        <w:tc>
+          <w:tcPr>
+            <w:tcW w:type="dxa" w:w="2608"/>
+          </w:tcPr>
+          <w:p>
+            <w:pPr>
+              <w:spacing w:after="0"/>
+            </w:pPr>
+            <w:r>
+              <w:rPr>
+                <w:rFonts w:ascii="Consolas" w:hAnsi="Consolas"/>
+                <w:b w:val="0"/>
+                <w:color w:val="233C7D"/>
+                <w:sz w:val="19"/>
+              </w:rPr>
+              <w:t>string (UUID)</w:t>
+            </w:r>
+          </w:p>
+        </w:tc>
+        <w:tc>
+          <w:tcPr>
+            <w:tcW w:type="dxa" w:w="4876"/>
+          </w:tcPr>
+          <w:p>
+            <w:pPr>
+              <w:spacing w:after="0"/>
+            </w:pPr>
+            <w:r>
+              <w:rPr>
+                <w:b w:val="0"/>
+                <w:sz w:val="19"/>
+              </w:rPr>
+              <w:t>Stabilimento dell'utente (da AuthUser.idProperty).</w:t>
+            </w:r>
+          </w:p>
+        </w:tc>
+      </w:tr>
+    </w:tbl>
+    <w:p>
+      <w:pPr>
+        <w:spacing w:after="40"/>
+      </w:pPr>
+    </w:p>
+    <w:p>
+      <w:pPr>
+        <w:pStyle w:val="Heading3"/>
+      </w:pPr>
+      <w:r>
+        <w:t>Esempio di richiesta (JSON)</w:t>
+      </w:r>
+    </w:p>
+    <w:p>
+      <w:pPr>
+        <w:keepNext/>
+        <w:spacing w:after="0"/>
+        <w:shd w:val="clear" w:color="auto" w:fill="F1F3F8"/>
+      </w:pPr>
+      <w:r>
+        <w:rPr>
+          <w:rFonts w:ascii="Consolas" w:hAnsi="Consolas"/>
+          <w:b w:val="0"/>
+          <w:color w:val="233C7D"/>
+          <w:sz w:val="19"/>
+        </w:rPr>
+        <w:t>{</w:t>
+      </w:r>
+    </w:p>
+    <w:p>
+      <w:pPr>
+        <w:keepNext/>
+        <w:spacing w:after="0"/>
+        <w:shd w:val="clear" w:color="auto" w:fill="F1F3F8"/>
+      </w:pPr>
+      <w:r>
+        <w:rPr>
+          <w:rFonts w:ascii="Consolas" w:hAnsi="Consolas"/>
+          <w:b w:val="0"/>
+          <w:color w:val="233C7D"/>
+          <w:sz w:val="19"/>
+        </w:rPr>
+        <w:t xml:space="preserve">  "idProperty": "5b1f3c7e-2d4a-4e8b-9c1d-7a6e5f4b3c2d"</w:t>
+      </w:r>
+    </w:p>
+    <w:p>
+      <w:pPr>
+        <w:keepNext w:val="0"/>
+        <w:spacing w:after="120"/>
+        <w:shd w:val="clear" w:color="auto" w:fill="F1F3F8"/>
+      </w:pPr>
+      <w:r>
+        <w:rPr>
+          <w:rFonts w:ascii="Consolas" w:hAnsi="Consolas"/>
+          <w:b w:val="0"/>
+          <w:color w:val="233C7D"/>
+          <w:sz w:val="19"/>
+        </w:rPr>
+        <w:t>}</w:t>
+      </w:r>
+    </w:p>
+    <w:p>
+      <w:pPr>
+        <w:pStyle w:val="Heading2"/>
+      </w:pPr>
+      <w:r>
+        <w:t>Risposta attesa dal server</w:t>
+      </w:r>
+    </w:p>
+    <w:p>
+      <w:pPr>
+        <w:spacing w:after="40"/>
+      </w:pPr>
+      <w:r>
+        <w:rPr>
+          <w:b/>
+        </w:rPr>
+        <w:t xml:space="preserve">Stato: </w:t>
+      </w:r>
+      <w:r>
+        <w:rPr>
+          <w:b w:val="0"/>
+        </w:rPr>
+        <w:t>200 OK</w:t>
+      </w:r>
+    </w:p>
+    <w:p>
+      <w:pPr>
+        <w:pStyle w:val="Heading3"/>
+      </w:pPr>
+      <w:r>
+        <w:rPr>
+          <w:b w:val="0"/>
+        </w:rPr>
+        <w:t xml:space="preserve">Corpo JSON: </w:t>
+      </w:r>
+      <w:r>
+        <w:rPr>
+          <w:rFonts w:ascii="Consolas" w:hAnsi="Consolas"/>
+          <w:b w:val="0"/>
+        </w:rPr>
+        <w:t>ComboboxItem[] (hotel)</w:t>
+      </w:r>
+    </w:p>
+    <w:tbl>
+      <w:tblPr>
+        <w:tblW w:type="auto" w:w="0"/>
+        <w:jc w:val="center"/>
+        <w:tblLayout w:type="fixed"/>
+        <w:tblLook w:firstColumn="1" w:firstRow="1" w:lastColumn="0" w:lastRow="0" w:noHBand="0" w:noVBand="1" w:val="04A0"/>
+        <w:tblBorders>
+          <w:top w:val="single" w:sz="4" w:color="C9CED8"/>
+          <w:left w:val="single" w:sz="4" w:color="C9CED8"/>
+          <w:bottom w:val="single" w:sz="4" w:color="C9CED8"/>
+          <w:right w:val="single" w:sz="4" w:color="C9CED8"/>
+          <w:insideH w:val="single" w:sz="4" w:color="C9CED8"/>
+          <w:insideV w:val="single" w:sz="4" w:color="C9CED8"/>
+        </w:tblBorders>
+      </w:tblPr>
+      <w:tblGrid>
+        <w:gridCol w:w="3289"/>
+        <w:gridCol w:w="3289"/>
+        <w:gridCol w:w="3289"/>
+      </w:tblGrid>
+      <w:tr>
+        <w:trPr>
+          <w:cantSplit w:val="true"/>
+          <w:tblHeader w:val="true"/>
+        </w:trPr>
+        <w:tc>
+          <w:tcPr>
+            <w:tcW w:type="dxa" w:w="2381"/>
+            <w:shd w:val="clear" w:color="auto" w:fill="233C7D"/>
+          </w:tcPr>
+          <w:p>
+            <w:pPr>
+              <w:spacing w:after="0"/>
+            </w:pPr>
+            <w:r>
+              <w:rPr>
+                <w:b/>
+                <w:color w:val="FFFFFF"/>
+                <w:sz w:val="20"/>
+              </w:rPr>
+              <w:t>Parametro</w:t>
+            </w:r>
+          </w:p>
+        </w:tc>
+        <w:tc>
+          <w:tcPr>
+            <w:tcW w:type="dxa" w:w="2608"/>
+            <w:shd w:val="clear" w:color="auto" w:fill="233C7D"/>
+          </w:tcPr>
+          <w:p>
+            <w:pPr>
+              <w:spacing w:after="0"/>
+            </w:pPr>
+            <w:r>
+              <w:rPr>
+                <w:b/>
+                <w:color w:val="FFFFFF"/>
+                <w:sz w:val="20"/>
+              </w:rPr>
+              <w:t>Tipo</w:t>
+            </w:r>
+          </w:p>
+        </w:tc>
+        <w:tc>
+          <w:tcPr>
+            <w:tcW w:type="dxa" w:w="4876"/>
+            <w:shd w:val="clear" w:color="auto" w:fill="233C7D"/>
+          </w:tcPr>
+          <w:p>
+            <w:pPr>
+              <w:spacing w:after="0"/>
+            </w:pPr>
+            <w:r>
+              <w:rPr>
+                <w:b/>
+                <w:color w:val="FFFFFF"/>
+                <w:sz w:val="20"/>
+              </w:rPr>
+              <w:t>Descrizione</w:t>
+            </w:r>
+          </w:p>
+        </w:tc>
+      </w:tr>
+      <w:tr>
+        <w:trPr>
+          <w:cantSplit w:val="true"/>
+        </w:trPr>
+        <w:tc>
+          <w:tcPr>
+            <w:tcW w:type="dxa" w:w="2381"/>
+          </w:tcPr>
+          <w:p>
+            <w:pPr>
+              <w:spacing w:after="0"/>
+            </w:pPr>
+            <w:r>
+              <w:rPr>
+                <w:rFonts w:ascii="Consolas" w:hAnsi="Consolas"/>
+                <w:b w:val="0"/>
+                <w:color w:val="233C7D"/>
+                <w:sz w:val="19"/>
+              </w:rPr>
+              <w:t>id</w:t>
+            </w:r>
+          </w:p>
+        </w:tc>
+        <w:tc>
+          <w:tcPr>
+            <w:tcW w:type="dxa" w:w="2608"/>
+          </w:tcPr>
+          <w:p>
+            <w:pPr>
+              <w:spacing w:after="0"/>
+            </w:pPr>
+            <w:r>
+              <w:rPr>
+                <w:rFonts w:ascii="Consolas" w:hAnsi="Consolas"/>
+                <w:b w:val="0"/>
+                <w:color w:val="233C7D"/>
+                <w:sz w:val="19"/>
+              </w:rPr>
+              <w:t>string (UUID)</w:t>
+            </w:r>
+          </w:p>
+        </w:tc>
+        <w:tc>
+          <w:tcPr>
+            <w:tcW w:type="dxa" w:w="4876"/>
+          </w:tcPr>
+          <w:p>
+            <w:pPr>
+              <w:spacing w:after="0"/>
+            </w:pPr>
+            <w:r>
+              <w:rPr>
+                <w:b w:val="0"/>
+                <w:sz w:val="19"/>
+              </w:rPr>
+              <w:t>Identificativo dell'hotel convenzionato: è il valore scelto nella tendina e quello mandato nei filtri (field idAffiliatedHotel).</w:t>
+            </w:r>
+          </w:p>
+        </w:tc>
+      </w:tr>
+      <w:tr>
+        <w:trPr>
+          <w:cantSplit w:val="true"/>
+        </w:trPr>
+        <w:tc>
+          <w:tcPr>
+            <w:tcW w:type="dxa" w:w="2381"/>
+            <w:shd w:val="clear" w:color="auto" w:fill="F1F3F8"/>
+          </w:tcPr>
+          <w:p>
+            <w:pPr>
+              <w:spacing w:after="0"/>
+            </w:pPr>
+            <w:r>
+              <w:rPr>
+                <w:rFonts w:ascii="Consolas" w:hAnsi="Consolas"/>
+                <w:b w:val="0"/>
+                <w:color w:val="233C7D"/>
+                <w:sz w:val="19"/>
+              </w:rPr>
+              <w:t>value</w:t>
+            </w:r>
+          </w:p>
+        </w:tc>
+        <w:tc>
+          <w:tcPr>
+            <w:tcW w:type="dxa" w:w="2608"/>
+            <w:shd w:val="clear" w:color="auto" w:fill="F1F3F8"/>
+          </w:tcPr>
+          <w:p>
+            <w:pPr>
+              <w:spacing w:after="0"/>
+            </w:pPr>
+            <w:r>
+              <w:rPr>
+                <w:rFonts w:ascii="Consolas" w:hAnsi="Consolas"/>
+                <w:b w:val="0"/>
+                <w:color w:val="233C7D"/>
+                <w:sz w:val="19"/>
+              </w:rPr>
+              <w:t>string</w:t>
+            </w:r>
+          </w:p>
+        </w:tc>
+        <w:tc>
+          <w:tcPr>
+            <w:tcW w:type="dxa" w:w="4876"/>
+            <w:shd w:val="clear" w:color="auto" w:fill="F1F3F8"/>
+          </w:tcPr>
+          <w:p>
+            <w:pPr>
+              <w:spacing w:after="0"/>
+            </w:pPr>
+            <w:r>
+              <w:rPr>
+                <w:b w:val="0"/>
+                <w:sz w:val="19"/>
+              </w:rPr>
+              <w:t>Nome dell'hotel, il testo mostrato nella tendina (es. Hotel Miramare).</w:t>
+            </w:r>
+          </w:p>
+        </w:tc>
+      </w:tr>
+    </w:tbl>
+    <w:p>
+      <w:pPr>
+        <w:spacing w:after="40"/>
+      </w:pPr>
+    </w:p>
+    <w:p>
+      <w:pPr>
+        <w:pStyle w:val="Heading3"/>
+      </w:pPr>
+      <w:r>
+        <w:t>Esempio di risposta (JSON)</w:t>
+      </w:r>
+    </w:p>
+    <w:p>
+      <w:pPr>
+        <w:keepNext/>
+      </w:pPr>
+      <w:r>
+        <w:t>La risposta è un array, senza un oggetto che lo contiene: ogni elemento ha solo id e value. Array vuoto se lo stabilimento non ha hotel convenzionati.</w:t>
+      </w:r>
+    </w:p>
+    <w:p>
+      <w:pPr>
+        <w:keepNext/>
+        <w:spacing w:after="0"/>
+        <w:shd w:val="clear" w:color="auto" w:fill="F1F3F8"/>
+      </w:pPr>
+      <w:r>
+        <w:rPr>
+          <w:rFonts w:ascii="Consolas" w:hAnsi="Consolas"/>
+          <w:b w:val="0"/>
+          <w:color w:val="233C7D"/>
+          <w:sz w:val="19"/>
+        </w:rPr>
+        <w:t>[</w:t>
+      </w:r>
+    </w:p>
+    <w:p>
+      <w:pPr>
+        <w:keepNext/>
+        <w:spacing w:after="0"/>
+        <w:shd w:val="clear" w:color="auto" w:fill="F1F3F8"/>
+      </w:pPr>
+      <w:r>
+        <w:rPr>
+          <w:rFonts w:ascii="Consolas" w:hAnsi="Consolas"/>
+          <w:b w:val="0"/>
+          <w:color w:val="233C7D"/>
+          <w:sz w:val="19"/>
+        </w:rPr>
+        <w:t xml:space="preserve">  {</w:t>
+      </w:r>
+    </w:p>
+    <w:p>
+      <w:pPr>
+        <w:keepNext/>
+        <w:spacing w:after="0"/>
+        <w:shd w:val="clear" w:color="auto" w:fill="F1F3F8"/>
+      </w:pPr>
+      <w:r>
+        <w:rPr>
+          <w:rFonts w:ascii="Consolas" w:hAnsi="Consolas"/>
+          <w:b w:val="0"/>
+          <w:color w:val="233C7D"/>
+          <w:sz w:val="19"/>
+        </w:rPr>
+        <w:t xml:space="preserve">    "id": "5b1d2c3e-4f50-4a61-8b72-9c0d1e2f3a41",</w:t>
+      </w:r>
+    </w:p>
+    <w:p>
+      <w:pPr>
+        <w:keepNext/>
+        <w:spacing w:after="0"/>
+        <w:shd w:val="clear" w:color="auto" w:fill="F1F3F8"/>
+      </w:pPr>
+      <w:r>
+        <w:rPr>
+          <w:rFonts w:ascii="Consolas" w:hAnsi="Consolas"/>
+          <w:b w:val="0"/>
+          <w:color w:val="233C7D"/>
+          <w:sz w:val="19"/>
+        </w:rPr>
+        <w:t xml:space="preserve">    "value": "Hotel Miramare"</w:t>
+      </w:r>
+    </w:p>
+    <w:p>
+      <w:pPr>
+        <w:keepNext/>
+        <w:spacing w:after="0"/>
+        <w:shd w:val="clear" w:color="auto" w:fill="F1F3F8"/>
+      </w:pPr>
+      <w:r>
+        <w:rPr>
+          <w:rFonts w:ascii="Consolas" w:hAnsi="Consolas"/>
+          <w:b w:val="0"/>
+          <w:color w:val="233C7D"/>
+          <w:sz w:val="19"/>
+        </w:rPr>
+        <w:t xml:space="preserve">  },</w:t>
+      </w:r>
+    </w:p>
+    <w:p>
+      <w:pPr>
+        <w:keepNext/>
+        <w:spacing w:after="0"/>
+        <w:shd w:val="clear" w:color="auto" w:fill="F1F3F8"/>
+      </w:pPr>
+      <w:r>
+        <w:rPr>
+          <w:rFonts w:ascii="Consolas" w:hAnsi="Consolas"/>
+          <w:b w:val="0"/>
+          <w:color w:val="233C7D"/>
+          <w:sz w:val="19"/>
+        </w:rPr>
+        <w:t xml:space="preserve">  {</w:t>
+      </w:r>
+    </w:p>
+    <w:p>
+      <w:pPr>
+        <w:keepNext/>
+        <w:spacing w:after="0"/>
+        <w:shd w:val="clear" w:color="auto" w:fill="F1F3F8"/>
+      </w:pPr>
+      <w:r>
+        <w:rPr>
+          <w:rFonts w:ascii="Consolas" w:hAnsi="Consolas"/>
+          <w:b w:val="0"/>
+          <w:color w:val="233C7D"/>
+          <w:sz w:val="19"/>
+        </w:rPr>
+        <w:t xml:space="preserve">    "id": "5b1d2c3e-4f50-4a61-8b72-9c0d1e2f3a42",</w:t>
+      </w:r>
+    </w:p>
+    <w:p>
+      <w:pPr>
+        <w:keepNext/>
+        <w:spacing w:after="0"/>
+        <w:shd w:val="clear" w:color="auto" w:fill="F1F3F8"/>
+      </w:pPr>
+      <w:r>
+        <w:rPr>
+          <w:rFonts w:ascii="Consolas" w:hAnsi="Consolas"/>
+          <w:b w:val="0"/>
+          <w:color w:val="233C7D"/>
+          <w:sz w:val="19"/>
+        </w:rPr>
+        <w:t xml:space="preserve">    "value": "Hotel 5 stelle"</w:t>
+      </w:r>
+    </w:p>
+    <w:p>
+      <w:pPr>
+        <w:keepNext/>
+        <w:spacing w:after="0"/>
+        <w:shd w:val="clear" w:color="auto" w:fill="F1F3F8"/>
+      </w:pPr>
+      <w:r>
+        <w:rPr>
+          <w:rFonts w:ascii="Consolas" w:hAnsi="Consolas"/>
+          <w:b w:val="0"/>
+          <w:color w:val="233C7D"/>
+          <w:sz w:val="19"/>
+        </w:rPr>
+        <w:t xml:space="preserve">  },</w:t>
+      </w:r>
+    </w:p>
+    <w:p>
+      <w:pPr>
+        <w:keepNext/>
+        <w:spacing w:after="0"/>
+        <w:shd w:val="clear" w:color="auto" w:fill="F1F3F8"/>
+      </w:pPr>
+      <w:r>
+        <w:rPr>
+          <w:rFonts w:ascii="Consolas" w:hAnsi="Consolas"/>
+          <w:b w:val="0"/>
+          <w:color w:val="233C7D"/>
+          <w:sz w:val="19"/>
+        </w:rPr>
+        <w:t xml:space="preserve">  {</w:t>
+      </w:r>
+    </w:p>
+    <w:p>
+      <w:pPr>
+        <w:keepNext/>
+        <w:spacing w:after="0"/>
+        <w:shd w:val="clear" w:color="auto" w:fill="F1F3F8"/>
+      </w:pPr>
+      <w:r>
+        <w:rPr>
+          <w:rFonts w:ascii="Consolas" w:hAnsi="Consolas"/>
+          <w:b w:val="0"/>
+          <w:color w:val="233C7D"/>
+          <w:sz w:val="19"/>
+        </w:rPr>
+        <w:t xml:space="preserve">    "id": "5b1d2c3e-4f50-4a61-8b72-9c0d1e2f3a43",</w:t>
+      </w:r>
+    </w:p>
+    <w:p>
+      <w:pPr>
+        <w:keepNext/>
+        <w:spacing w:after="0"/>
+        <w:shd w:val="clear" w:color="auto" w:fill="F1F3F8"/>
+      </w:pPr>
+      <w:r>
+        <w:rPr>
+          <w:rFonts w:ascii="Consolas" w:hAnsi="Consolas"/>
+          <w:b w:val="0"/>
+          <w:color w:val="233C7D"/>
+          <w:sz w:val="19"/>
+        </w:rPr>
+        <w:t xml:space="preserve">    "value": "Hotel Sun"</w:t>
+      </w:r>
+    </w:p>
+    <w:p>
+      <w:pPr>
+        <w:keepNext/>
+        <w:spacing w:after="0"/>
+        <w:shd w:val="clear" w:color="auto" w:fill="F1F3F8"/>
+      </w:pPr>
+      <w:r>
+        <w:rPr>
+          <w:rFonts w:ascii="Consolas" w:hAnsi="Consolas"/>
+          <w:b w:val="0"/>
+          <w:color w:val="233C7D"/>
+          <w:sz w:val="19"/>
+        </w:rPr>
+        <w:t xml:space="preserve">  },</w:t>
+      </w:r>
+    </w:p>
+    <w:p>
+      <w:pPr>
+        <w:keepNext/>
+        <w:spacing w:after="0"/>
+        <w:shd w:val="clear" w:color="auto" w:fill="F1F3F8"/>
+      </w:pPr>
+      <w:r>
+        <w:rPr>
+          <w:rFonts w:ascii="Consolas" w:hAnsi="Consolas"/>
+          <w:b w:val="0"/>
+          <w:color w:val="233C7D"/>
+          <w:sz w:val="19"/>
+        </w:rPr>
+        <w:t xml:space="preserve">  {</w:t>
+      </w:r>
+    </w:p>
+    <w:p>
+      <w:pPr>
+        <w:keepNext/>
+        <w:spacing w:after="0"/>
+        <w:shd w:val="clear" w:color="auto" w:fill="F1F3F8"/>
+      </w:pPr>
+      <w:r>
+        <w:rPr>
+          <w:rFonts w:ascii="Consolas" w:hAnsi="Consolas"/>
+          <w:b w:val="0"/>
+          <w:color w:val="233C7D"/>
+          <w:sz w:val="19"/>
+        </w:rPr>
+        <w:t xml:space="preserve">    "id": "5b1d2c3e-4f50-4a61-8b72-9c0d1e2f3a44",</w:t>
+      </w:r>
+    </w:p>
+    <w:p>
+      <w:pPr>
+        <w:keepNext/>
+        <w:spacing w:after="0"/>
+        <w:shd w:val="clear" w:color="auto" w:fill="F1F3F8"/>
+      </w:pPr>
+      <w:r>
+        <w:rPr>
+          <w:rFonts w:ascii="Consolas" w:hAnsi="Consolas"/>
+          <w:b w:val="0"/>
+          <w:color w:val="233C7D"/>
+          <w:sz w:val="19"/>
+        </w:rPr>
+        <w:t xml:space="preserve">    "value": "Beach Hotel"</w:t>
+      </w:r>
+    </w:p>
+    <w:p>
+      <w:pPr>
+        <w:keepNext/>
+        <w:spacing w:after="0"/>
+        <w:shd w:val="clear" w:color="auto" w:fill="F1F3F8"/>
+      </w:pPr>
+      <w:r>
+        <w:rPr>
+          <w:rFonts w:ascii="Consolas" w:hAnsi="Consolas"/>
+          <w:b w:val="0"/>
+          <w:color w:val="233C7D"/>
+          <w:sz w:val="19"/>
+        </w:rPr>
+        <w:t xml:space="preserve">  }</w:t>
+      </w:r>
+    </w:p>
+    <w:p>
+      <w:pPr>
+        <w:keepNext w:val="0"/>
+        <w:spacing w:after="120"/>
+        <w:shd w:val="clear" w:color="auto" w:fill="F1F3F8"/>
+      </w:pPr>
+      <w:r>
+        <w:rPr>
+          <w:rFonts w:ascii="Consolas" w:hAnsi="Consolas"/>
+          <w:b w:val="0"/>
+          <w:color w:val="233C7D"/>
+          <w:sz w:val="19"/>
+        </w:rPr>
+        <w:t>]</w:t>
       </w:r>
     </w:p>
     <w:p>

</xml_diff>